<commit_message>
Point guides and README at the renamed repository AIXLab-Atlas
</commit_message>
<xml_diff>
--- a/onboarding/AIX-Lab-Atlas-Onboarding.docx
+++ b/onboarding/AIX-Lab-Atlas-Onboarding.docx
@@ -402,7 +402,7 @@
           <w:rPr>
             <w:rStyle w:val="Hyperlink"/>
           </w:rPr>
-          <w:t xml:space="preserve">RPalis/ux-atlas-aixlab</w:t>
+          <w:t xml:space="preserve">RPalis/AIXLab-Atlas</w:t>
         </w:r>
       </w:hyperlink>
       <w:r>
@@ -1630,7 +1630,7 @@
         <w:rPr>
           <w:b/>
         </w:rPr>
-        <w:t xml:space="preserve">RPalis invited you to collaborate on RPalis/ux-atlas-aixlab</w:t>
+        <w:t xml:space="preserve">RPalis invited you to collaborate on RPalis/AIXLab-Atlas</w:t>
       </w:r>
       <w:r>
         <w:t xml:space="preserve">. Click </w:t>
@@ -1768,7 +1768,7 @@
         <w:pStyle w:val="CodeBlock"/>
       </w:pPr>
       <w:r>
-        <w:t xml:space="preserve">https://github.com/RPalis/ux-atlas-aixlab/archive/refs/heads/update-readme-retire-competitors-duplicate.zip</w:t>
+        <w:t xml:space="preserve">https://github.com/RPalis/AIXLab-Atlas/archive/refs/heads/update-readme-retire-competitors-duplicate.zip</w:t>
       </w:r>
     </w:p>
     <w:p>
@@ -1795,7 +1795,7 @@
           <w:rPr>
             <w:rStyle w:val="Hyperlink"/>
           </w:rPr>
-          <w:t xml:space="preserve">https://github.com/RPalis/ux-atlas-aixlab</w:t>
+          <w:t xml:space="preserve">https://github.com/RPalis/AIXLab-Atlas</w:t>
         </w:r>
       </w:hyperlink>
       <w:r>
@@ -8748,7 +8748,7 @@
                 <w:rPr>
                   <w:rStyle w:val="Hyperlink"/>
                 </w:rPr>
-                <w:t xml:space="preserve">https://github.com/RPalis/ux-atlas-aixlab</w:t>
+                <w:t xml:space="preserve">https://github.com/RPalis/AIXLab-Atlas</w:t>
               </w:r>
             </w:hyperlink>
           </w:p>
@@ -8784,7 +8784,7 @@
                 <w:rPr>
                   <w:rStyle w:val="Hyperlink"/>
                 </w:rPr>
-                <w:t xml:space="preserve">https://github.com/RPalis/ux-atlas-aixlab/tree/update-readme-retire-competitors-duplicate</w:t>
+                <w:t xml:space="preserve">https://github.com/RPalis/AIXLab-Atlas/tree/update-readme-retire-competitors-duplicate</w:t>
               </w:r>
             </w:hyperlink>
           </w:p>
@@ -8820,7 +8820,7 @@
                 <w:rPr>
                   <w:rStyle w:val="Hyperlink"/>
                 </w:rPr>
-                <w:t xml:space="preserve">https://github.com/RPalis/ux-atlas-aixlab/archive/refs/heads/update-readme-retire-competitors-duplicate.zip</w:t>
+                <w:t xml:space="preserve">https://github.com/RPalis/AIXLab-Atlas/archive/refs/heads/update-readme-retire-competitors-duplicate.zip</w:t>
               </w:r>
             </w:hyperlink>
           </w:p>

</xml_diff>